<commit_message>
Terminado nuevo formato de pagaré
</commit_message>
<xml_diff>
--- a/public/report_templates/creditos/clientes/rptContratoCredito.docx
+++ b/public/report_templates/creditos/clientes/rptContratoCredito.docx
@@ -8495,7 +8495,18 @@
                                 <w:sz w:val="16"/>
                                 <w:szCs w:val="16"/>
                               </w:rPr>
-                              <w:t>FIADOR SOLIDARIO (Firma y huella digital)</w:t>
+                              <w:t>AVAL</w:t>
+                            </w:r>
+                            <w:r>
+                              <w:rPr>
+                                <w:rFonts w:ascii="DejaVu Sans Light" w:hAnsi="DejaVu Sans Light" w:cs="DejaVu Sans Light"/>
+                                <w:b/>
+                                <w:bCs/>
+                                <w:color w:val="000000" w:themeColor="text1"/>
+                                <w:sz w:val="16"/>
+                                <w:szCs w:val="16"/>
+                              </w:rPr>
+                              <w:t xml:space="preserve"> SOLIDARIO (Firma y huella digital)</w:t>
                             </w:r>
                           </w:p>
                           <w:p>
@@ -8642,7 +8653,18 @@
                           <w:sz w:val="16"/>
                           <w:szCs w:val="16"/>
                         </w:rPr>
-                        <w:t>FIADOR SOLIDARIO (Firma y huella digital)</w:t>
+                        <w:t>AVAL</w:t>
+                      </w:r>
+                      <w:r>
+                        <w:rPr>
+                          <w:rFonts w:ascii="DejaVu Sans Light" w:hAnsi="DejaVu Sans Light" w:cs="DejaVu Sans Light"/>
+                          <w:b/>
+                          <w:bCs/>
+                          <w:color w:val="000000" w:themeColor="text1"/>
+                          <w:sz w:val="16"/>
+                          <w:szCs w:val="16"/>
+                        </w:rPr>
+                        <w:t xml:space="preserve"> SOLIDARIO (Firma y huella digital)</w:t>
                       </w:r>
                     </w:p>
                     <w:p>
@@ -8827,7 +8849,18 @@
                                 <w:sz w:val="16"/>
                                 <w:szCs w:val="16"/>
                               </w:rPr>
-                              <w:t>FIADOR SOLIDARIO (Firma y huella digital)</w:t>
+                              <w:t>AVAL</w:t>
+                            </w:r>
+                            <w:r>
+                              <w:rPr>
+                                <w:rFonts w:ascii="DejaVu Sans Light" w:hAnsi="DejaVu Sans Light" w:cs="DejaVu Sans Light"/>
+                                <w:b/>
+                                <w:bCs/>
+                                <w:color w:val="000000" w:themeColor="text1"/>
+                                <w:sz w:val="16"/>
+                                <w:szCs w:val="16"/>
+                              </w:rPr>
+                              <w:t xml:space="preserve"> SOLIDARIO (Firma y huella digital)</w:t>
                             </w:r>
                           </w:p>
                           <w:p>
@@ -8974,7 +9007,18 @@
                           <w:sz w:val="16"/>
                           <w:szCs w:val="16"/>
                         </w:rPr>
-                        <w:t>FIADOR SOLIDARIO (Firma y huella digital)</w:t>
+                        <w:t>AVAL</w:t>
+                      </w:r>
+                      <w:r>
+                        <w:rPr>
+                          <w:rFonts w:ascii="DejaVu Sans Light" w:hAnsi="DejaVu Sans Light" w:cs="DejaVu Sans Light"/>
+                          <w:b/>
+                          <w:bCs/>
+                          <w:color w:val="000000" w:themeColor="text1"/>
+                          <w:sz w:val="16"/>
+                          <w:szCs w:val="16"/>
+                        </w:rPr>
+                        <w:t xml:space="preserve"> SOLIDARIO (Firma y huella digital)</w:t>
                       </w:r>
                     </w:p>
                     <w:p>
@@ -10452,7 +10496,18 @@
                                 <w:sz w:val="16"/>
                                 <w:szCs w:val="16"/>
                               </w:rPr>
-                              <w:t>FIADOR SOLIDARIO (Firma y huella digital)</w:t>
+                              <w:t>AVAL</w:t>
+                            </w:r>
+                            <w:r>
+                              <w:rPr>
+                                <w:rFonts w:ascii="DejaVu Sans Light" w:hAnsi="DejaVu Sans Light" w:cs="DejaVu Sans Light"/>
+                                <w:b/>
+                                <w:bCs/>
+                                <w:color w:val="000000" w:themeColor="text1"/>
+                                <w:sz w:val="16"/>
+                                <w:szCs w:val="16"/>
+                              </w:rPr>
+                              <w:t xml:space="preserve"> SOLIDARIO (Firma y huella digital)</w:t>
                             </w:r>
                           </w:p>
                           <w:p>
@@ -10630,7 +10685,18 @@
                           <w:sz w:val="16"/>
                           <w:szCs w:val="16"/>
                         </w:rPr>
-                        <w:t>FIADOR SOLIDARIO (Firma y huella digital)</w:t>
+                        <w:t>AVAL</w:t>
+                      </w:r>
+                      <w:r>
+                        <w:rPr>
+                          <w:rFonts w:ascii="DejaVu Sans Light" w:hAnsi="DejaVu Sans Light" w:cs="DejaVu Sans Light"/>
+                          <w:b/>
+                          <w:bCs/>
+                          <w:color w:val="000000" w:themeColor="text1"/>
+                          <w:sz w:val="16"/>
+                          <w:szCs w:val="16"/>
+                        </w:rPr>
+                        <w:t xml:space="preserve"> SOLIDARIO (Firma y huella digital)</w:t>
                       </w:r>
                     </w:p>
                     <w:p>
@@ -10846,7 +10912,18 @@
                                 <w:sz w:val="16"/>
                                 <w:szCs w:val="16"/>
                               </w:rPr>
-                              <w:t>FIADOR SOLIDARIO (Firma y huella digital)</w:t>
+                              <w:t>AVAL</w:t>
+                            </w:r>
+                            <w:r>
+                              <w:rPr>
+                                <w:rFonts w:ascii="DejaVu Sans Light" w:hAnsi="DejaVu Sans Light" w:cs="DejaVu Sans Light"/>
+                                <w:b/>
+                                <w:bCs/>
+                                <w:color w:val="000000" w:themeColor="text1"/>
+                                <w:sz w:val="16"/>
+                                <w:szCs w:val="16"/>
+                              </w:rPr>
+                              <w:t xml:space="preserve"> SOLIDARIO (Firma y huella digital)</w:t>
                             </w:r>
                           </w:p>
                           <w:p>
@@ -11024,7 +11101,18 @@
                           <w:sz w:val="16"/>
                           <w:szCs w:val="16"/>
                         </w:rPr>
-                        <w:t>FIADOR SOLIDARIO (Firma y huella digital)</w:t>
+                        <w:t>AVAL</w:t>
+                      </w:r>
+                      <w:r>
+                        <w:rPr>
+                          <w:rFonts w:ascii="DejaVu Sans Light" w:hAnsi="DejaVu Sans Light" w:cs="DejaVu Sans Light"/>
+                          <w:b/>
+                          <w:bCs/>
+                          <w:color w:val="000000" w:themeColor="text1"/>
+                          <w:sz w:val="16"/>
+                          <w:szCs w:val="16"/>
+                        </w:rPr>
+                        <w:t xml:space="preserve"> SOLIDARIO (Firma y huella digital)</w:t>
                       </w:r>
                     </w:p>
                     <w:p>

</xml_diff>

<commit_message>
Corrección en la lógica de emisión de comprobantes y ajustes en el cálculo de límites diarios
</commit_message>
<xml_diff>
--- a/public/report_templates/creditos/clientes/rptContratoCredito.docx
+++ b/public/report_templates/creditos/clientes/rptContratoCredito.docx
@@ -7081,6 +7081,83 @@
           <w:szCs w:val="18"/>
         </w:rPr>
       </w:pPr>
+      <w:r>
+        <w:rPr>
+          <w:noProof/>
+        </w:rPr>
+        <w:drawing>
+          <wp:anchor distT="0" distB="0" distL="114300" distR="114300" simplePos="0" relativeHeight="251680768" behindDoc="0" locked="0" layoutInCell="1" allowOverlap="1" wp14:anchorId="161A7430" wp14:editId="03168DA6">
+            <wp:simplePos x="0" y="0"/>
+            <wp:positionH relativeFrom="margin">
+              <wp:posOffset>4267835</wp:posOffset>
+            </wp:positionH>
+            <wp:positionV relativeFrom="paragraph">
+              <wp:posOffset>34214</wp:posOffset>
+            </wp:positionV>
+            <wp:extent cx="1397203" cy="1291872"/>
+            <wp:effectExtent l="0" t="0" r="0" b="0"/>
+            <wp:wrapNone/>
+            <wp:docPr id="2" name="Imagen 2"/>
+            <wp:cNvGraphicFramePr>
+              <a:graphicFrameLocks xmlns:a="http://schemas.openxmlformats.org/drawingml/2006/main" noChangeAspect="1"/>
+            </wp:cNvGraphicFramePr>
+            <a:graphic xmlns:a="http://schemas.openxmlformats.org/drawingml/2006/main">
+              <a:graphicData uri="http://schemas.openxmlformats.org/drawingml/2006/picture">
+                <pic:pic xmlns:pic="http://schemas.openxmlformats.org/drawingml/2006/picture">
+                  <pic:nvPicPr>
+                    <pic:cNvPr id="0" name="Picture 1"/>
+                    <pic:cNvPicPr>
+                      <a:picLocks noChangeAspect="1" noChangeArrowheads="1"/>
+                    </pic:cNvPicPr>
+                  </pic:nvPicPr>
+                  <pic:blipFill>
+                    <a:blip r:embed="rId7" cstate="print">
+                      <a:clrChange>
+                        <a:clrFrom>
+                          <a:srgbClr val="FFFFFF"/>
+                        </a:clrFrom>
+                        <a:clrTo>
+                          <a:srgbClr val="FFFFFF">
+                            <a:alpha val="0"/>
+                          </a:srgbClr>
+                        </a:clrTo>
+                      </a:clrChange>
+                      <a:extLst>
+                        <a:ext uri="{28A0092B-C50C-407E-A947-70E740481C1C}">
+                          <a14:useLocalDpi xmlns:a14="http://schemas.microsoft.com/office/drawing/2010/main" val="0"/>
+                        </a:ext>
+                      </a:extLst>
+                    </a:blip>
+                    <a:srcRect/>
+                    <a:stretch>
+                      <a:fillRect/>
+                    </a:stretch>
+                  </pic:blipFill>
+                  <pic:spPr bwMode="auto">
+                    <a:xfrm>
+                      <a:off x="0" y="0"/>
+                      <a:ext cx="1397203" cy="1291872"/>
+                    </a:xfrm>
+                    <a:prstGeom prst="rect">
+                      <a:avLst/>
+                    </a:prstGeom>
+                    <a:noFill/>
+                    <a:ln>
+                      <a:noFill/>
+                    </a:ln>
+                  </pic:spPr>
+                </pic:pic>
+              </a:graphicData>
+            </a:graphic>
+            <wp14:sizeRelH relativeFrom="margin">
+              <wp14:pctWidth>0</wp14:pctWidth>
+            </wp14:sizeRelH>
+            <wp14:sizeRelV relativeFrom="margin">
+              <wp14:pctHeight>0</wp14:pctHeight>
+            </wp14:sizeRelV>
+          </wp:anchor>
+        </w:drawing>
+      </w:r>
     </w:p>
     <w:p>
       <w:pPr>
@@ -9268,6 +9345,83 @@
           <w:szCs w:val="18"/>
         </w:rPr>
       </w:pPr>
+      <w:r>
+        <w:rPr>
+          <w:noProof/>
+        </w:rPr>
+        <w:drawing>
+          <wp:anchor distT="0" distB="0" distL="114300" distR="114300" simplePos="0" relativeHeight="251682816" behindDoc="0" locked="0" layoutInCell="1" allowOverlap="1" wp14:anchorId="27F489C7" wp14:editId="6DAF8F3A">
+            <wp:simplePos x="0" y="0"/>
+            <wp:positionH relativeFrom="margin">
+              <wp:align>center</wp:align>
+            </wp:positionH>
+            <wp:positionV relativeFrom="paragraph">
+              <wp:posOffset>146405</wp:posOffset>
+            </wp:positionV>
+            <wp:extent cx="1397203" cy="1291872"/>
+            <wp:effectExtent l="0" t="0" r="0" b="0"/>
+            <wp:wrapNone/>
+            <wp:docPr id="8" name="Imagen 8"/>
+            <wp:cNvGraphicFramePr>
+              <a:graphicFrameLocks xmlns:a="http://schemas.openxmlformats.org/drawingml/2006/main" noChangeAspect="1"/>
+            </wp:cNvGraphicFramePr>
+            <a:graphic xmlns:a="http://schemas.openxmlformats.org/drawingml/2006/main">
+              <a:graphicData uri="http://schemas.openxmlformats.org/drawingml/2006/picture">
+                <pic:pic xmlns:pic="http://schemas.openxmlformats.org/drawingml/2006/picture">
+                  <pic:nvPicPr>
+                    <pic:cNvPr id="0" name="Picture 1"/>
+                    <pic:cNvPicPr>
+                      <a:picLocks noChangeAspect="1" noChangeArrowheads="1"/>
+                    </pic:cNvPicPr>
+                  </pic:nvPicPr>
+                  <pic:blipFill>
+                    <a:blip r:embed="rId7" cstate="print">
+                      <a:clrChange>
+                        <a:clrFrom>
+                          <a:srgbClr val="FFFFFF"/>
+                        </a:clrFrom>
+                        <a:clrTo>
+                          <a:srgbClr val="FFFFFF">
+                            <a:alpha val="0"/>
+                          </a:srgbClr>
+                        </a:clrTo>
+                      </a:clrChange>
+                      <a:extLst>
+                        <a:ext uri="{28A0092B-C50C-407E-A947-70E740481C1C}">
+                          <a14:useLocalDpi xmlns:a14="http://schemas.microsoft.com/office/drawing/2010/main" val="0"/>
+                        </a:ext>
+                      </a:extLst>
+                    </a:blip>
+                    <a:srcRect/>
+                    <a:stretch>
+                      <a:fillRect/>
+                    </a:stretch>
+                  </pic:blipFill>
+                  <pic:spPr bwMode="auto">
+                    <a:xfrm>
+                      <a:off x="0" y="0"/>
+                      <a:ext cx="1397203" cy="1291872"/>
+                    </a:xfrm>
+                    <a:prstGeom prst="rect">
+                      <a:avLst/>
+                    </a:prstGeom>
+                    <a:noFill/>
+                    <a:ln>
+                      <a:noFill/>
+                    </a:ln>
+                  </pic:spPr>
+                </pic:pic>
+              </a:graphicData>
+            </a:graphic>
+            <wp14:sizeRelH relativeFrom="margin">
+              <wp14:pctWidth>0</wp14:pctWidth>
+            </wp14:sizeRelH>
+            <wp14:sizeRelV relativeFrom="margin">
+              <wp14:pctHeight>0</wp14:pctHeight>
+            </wp14:sizeRelV>
+          </wp:anchor>
+        </w:drawing>
+      </w:r>
       <w:r>
         <w:rPr>
           <w:rFonts w:ascii="DejaVu Sans Light" w:hAnsi="DejaVu Sans Light" w:cs="DejaVu Sans Light"/>
@@ -11334,7 +11488,7 @@
       </w:pPr>
     </w:p>
     <w:sectPr>
-      <w:headerReference w:type="default" r:id="rId7"/>
+      <w:headerReference w:type="default" r:id="rId8"/>
       <w:pgSz w:w="11906" w:h="16838"/>
       <w:pgMar w:top="720" w:right="720" w:bottom="720" w:left="720" w:header="708" w:footer="708" w:gutter="0"/>
       <w:cols w:space="708"/>

</xml_diff>